<commit_message>
chore: sync workspace state - disable naming convention commit enforcement and other pending updates
</commit_message>
<xml_diff>
--- a/QRMaker/assets/qr_template.docx
+++ b/QRMaker/assets/qr_template.docx
@@ -6,7 +6,7 @@
       <w:sdtPr>
         <w:alias w:val="QR Source Template"/>
         <w:tag w:val="qr_template_source"/>
-        <w:id w:val="-119693634"/>
+        <w:id w:val="620576942"/>
         <w:placeholder>
           <w:docPart w:val="DefaultPlaceholder_-1854013440"/>
         </w:placeholder>
@@ -1173,8 +1173,13 @@
   <w:rsids>
     <w:rsidRoot w:val="00A905E1"/>
     <w:rsid w:val="000C1033"/>
+    <w:rsid w:val="003D7348"/>
     <w:rsid w:val="004611EA"/>
     <w:rsid w:val="00A905E1"/>
+    <w:rsid w:val="00B34D06"/>
+    <w:rsid w:val="00DB7369"/>
+    <w:rsid w:val="00E458F5"/>
+    <w:rsid w:val="00E8591B"/>
   </w:rsids>
   <m:mathPr>
     <m:mathFont m:val="Cambria Math"/>

</xml_diff>